<commit_message>
docs(ubiquity): sharpen division-by-zero rebuttal in para [27]
Replace implicit contrast with explicit side-by-side:
'A division-by-zero introduces uncertainty at execution time within a
known code path that has an explicit handler and bounded rollback scope
by design. An agent, by contrast, introduces uncertainty at planning
time across an open-ended, runtime-discovered action space with no
pre-defined transaction boundary or equivalent handler.'

Directly answers Editor 2's core novelty objection without overclaiming.
Suggested by agent-reviewer pass before submission.
</commit_message>
<xml_diff>
--- a/docs/ubiquity/Sibasis-ARG-Ubiquity-commentary-v1.docx
+++ b/docs/ubiquity/Sibasis-ARG-Ubiquity-commentary-v1.docx
@@ -456,7 +456,25 @@
           <w:kern w:val="0"/>
           <w14:ligatures w14:val="none"/>
         </w:rPr>
-        <w:t>I call this discipline Autonomic Reliability Governance (ARG).</w:t>
+        <w:t xml:space="preserve">I call this discipline </w:t>
+      </w:r>
+      <w:r>
+        <w:rPr>
+          <w:rFonts w:ascii="Times New Roman" w:eastAsia="Times New Roman" w:hAnsi="Times New Roman" w:cs="Times New Roman"/>
+          <w:b/>
+          <w:bCs/>
+          <w:kern w:val="0"/>
+          <w14:ligatures w14:val="none"/>
+        </w:rPr>
+        <w:t>Autonomic Reliability Governance (ARG)</w:t>
+      </w:r>
+      <w:r>
+        <w:rPr>
+          <w:rFonts w:ascii="Times New Roman" w:eastAsia="Times New Roman" w:hAnsi="Times New Roman" w:cs="Times New Roman"/>
+          <w:kern w:val="0"/>
+          <w14:ligatures w14:val="none"/>
+        </w:rPr>
+        <w:t>.</w:t>
       </w:r>
       <w:r>
         <w:rPr>
@@ -1142,15 +1160,14 @@
           <w:kern w:val="0"/>
           <w14:ligatures w14:val="none"/>
         </w:rPr>
-        <w:t xml:space="preserve">Operate under uncertainty: </w:t>
-      </w:r>
-      <w:r>
-        <w:rPr>
-          <w:rFonts w:ascii="Times New Roman" w:eastAsia="Times New Roman" w:hAnsi="Times New Roman" w:cs="Times New Roman"/>
-          <w:kern w:val="0"/>
-          <w14:ligatures w14:val="none"/>
-        </w:rPr>
-        <w:t>incidents produce ambiguous signals; partial telemetry invites misdiagnosis and overcorrection. Unlike a code exception caught within a known path, an agent reasoning incorrectly about a three-service interaction introduces uncertainty at planning time, with no equivalent handler. ARG is that handler.</w:t>
+        <w:t>Operate under uncertainty: incidents produce ambiguous signals; partial telemetry invites misdiagnosis and overcorrection. A division-by-zero introduces uncertainty at execution time within a known code path that has an explicit handler and bounded rollback scope by design. An agent, by contrast, introduces uncertainty at planning time across an open-ended, runtime-discovered action space with no pre-defined transaction boundary or equivalent handler. ARG is that handler.</w:t>
+      </w:r>
+      <w:r>
+        <w:rPr>
+          <w:rFonts w:ascii="Times New Roman" w:eastAsia="Times New Roman" w:hAnsi="Times New Roman" w:cs="Times New Roman"/>
+          <w:kern w:val="0"/>
+          <w14:ligatures w14:val="none"/>
+        </w:rPr>
       </w:r>
     </w:p>
     <w:p>

</xml_diff>